<commit_message>
Add Ultimatic keying mode
Add Ultimatic as a third paddle mode alongside Iambic A and B. When both
paddles are squeezed, the most recently pressed paddle takes over and
repeats instead of alternating. GPIO16 long press now cycles A -> B -> U
and the header shows U in Ultimatic mode.

The keyer mode is stored in NVS as "kmode", falling back to the old
"modeB" flag so existing settings carry over without a reset.

Bump firmware to v1.4.6 and update README, CHANGELOG, the Operator's
Manual and User Guide, and regenerate the manual PDF from the docx.

Co-Authored-By: Claude Opus 5.5 (1M context) <noreply@anthropic.com>
</commit_message>
<xml_diff>
--- a/docs/K0WLY_CW_Keyer_Manual.docx
+++ b/docs/K0WLY_CW_Keyer_Manual.docx
@@ -63,7 +63,7 @@
           <w:sz w:val="24"/>
           <w:szCs w:val="24"/>
         </w:rPr>
-        <w:t xml:space="preserve">Version 1.4.4</w:t>
+        <w:t xml:space="preserve">Version 1.4.6</w:t>
       </w:r>
     </w:p>
     <w:p>
@@ -159,7 +159,7 @@
           <w:sz w:val="22"/>
           <w:szCs w:val="22"/>
         </w:rPr>
-        <w:t xml:space="preserve">The K0WLY Two-Way CW Keyer is an ESP32-S3 based iambic keyer on the LilyGO T-Display S3 AMOLED (v1.4.4).</w:t>
+        <w:t xml:space="preserve">The K0WLY Two-Way CW Keyer is an ESP32-S3 based iambic keyer on the LilyGO T-Display S3 AMOLED (v1.4.6).</w:t>
       </w:r>
     </w:p>
     <w:p>
@@ -185,7 +185,7 @@
           <w:sz w:val="22"/>
           <w:szCs w:val="22"/>
         </w:rPr>
-        <w:t xml:space="preserve">Iambic Mode A or B keyer, 5–40 WPM, straight key mode</w:t>
+        <w:t xml:space="preserve">Iambic Mode A/B or Ultimatic keyer, 5–40 WPM, straight key mode</w:t>
       </w:r>
     </w:p>
     <w:p>
@@ -257,7 +257,7 @@
           <w:sz w:val="22"/>
           <w:szCs w:val="22"/>
         </w:rPr>
-        <w:t xml:space="preserve">Paddle reverse and Iambic Mode A/B via GPIO16</w:t>
+        <w:t xml:space="preserve">Paddle reverse and keyer mode (A/B/Ultimatic) via GPIO16</w:t>
       </w:r>
     </w:p>
     <w:p>
@@ -612,7 +612,7 @@
                 <w:sz w:val="20"/>
                 <w:szCs w:val="20"/>
               </w:rPr>
-              <w:t xml:space="preserve">WPM, Hz, DLY, VOL, GAP, A/B/SK, SOLO/DUAL</w:t>
+              <w:t xml:space="preserve">WPM, Hz, DLY, VOL, GAP, A/B/U/SK, SOLO/DUAL</w:t>
             </w:r>
           </w:p>
         </w:tc>
@@ -1032,7 +1032,7 @@
           <w:sz w:val="22"/>
           <w:szCs w:val="22"/>
         </w:rPr>
-        <w:t xml:space="preserve">A / B / SK — Iambic Mode A, Iambic Mode B, or Straight Key</w:t>
+        <w:t xml:space="preserve">A / B / U / SK — Iambic Mode A, Iambic Mode B, Ultimatic, or Straight Key</w:t>
       </w:r>
     </w:p>
     <w:p>
@@ -1803,7 +1803,7 @@
                 <w:sz w:val="20"/>
                 <w:szCs w:val="20"/>
               </w:rPr>
-              <w:t xml:space="preserve">Paddle Reverse / Mode A/B</w:t>
+              <w:t xml:space="preserve">Paddle Reverse / Keyer Mode</w:t>
             </w:r>
           </w:p>
         </w:tc>
@@ -1865,7 +1865,7 @@
                 <w:sz w:val="20"/>
                 <w:szCs w:val="20"/>
               </w:rPr>
-              <w:t xml:space="preserve">Short=dit/dah swap, Long=Mode A/B toggle</w:t>
+              <w:t xml:space="preserve">Short=dit/dah swap, Long=cycle A/B/U</w:t>
             </w:r>
           </w:p>
         </w:tc>
@@ -2383,7 +2383,7 @@
                 <w:sz w:val="20"/>
                 <w:szCs w:val="20"/>
               </w:rPr>
-              <w:t xml:space="preserve">Toggles Iambic Mode A / Mode B — header shows A or B</w:t>
+              <w:t xml:space="preserve">Cycles Iambic Mode A → Mode B → Ultimatic — header shows A, B or U</w:t>
             </w:r>
           </w:p>
         </w:tc>
@@ -2410,7 +2410,7 @@
           <w:sz w:val="26"/>
           <w:szCs w:val="26"/>
         </w:rPr>
-        <w:t xml:space="preserve">3.3 Iambic Modes</w:t>
+        <w:t xml:space="preserve">3.3 Keyer Modes</w:t>
       </w:r>
     </w:p>
     <w:p>
@@ -2449,6 +2449,29 @@
           <w:szCs w:val="22"/>
         </w:rPr>
         <w:t xml:space="preserve">Mode B — when both paddles are released during an element, the keyer sends one additional opposite element before stopping. Preferred by some operators for smoother squeeze keying.</w:t>
+      </w:r>
+    </w:p>
+    <w:p>
+      <w:pPr>
+        <w:spacing w:after="120"/>
+      </w:pPr>
+      <w:r>
+        <w:t xml:space="preserve"/>
+      </w:r>
+    </w:p>
+    <w:p>
+      <w:pPr>
+        <w:spacing w:after="120"/>
+      </w:pPr>
+      <w:r>
+        <w:rPr>
+          <w:rFonts w:ascii="Arial" w:cs="Arial" w:eastAsia="Arial" w:hAnsi="Arial"/>
+          <w:b w:val="false"/>
+          <w:bCs w:val="false"/>
+          <w:sz w:val="22"/>
+          <w:szCs w:val="22"/>
+        </w:rPr>
+        <w:t xml:space="preserve">Ultimatic (U) — when both paddles are held, the paddle pressed most recently takes over and repeats instead of alternating. Example: hold dah, then squeeze dit — the keyer sends one dah followed by continuous dits until dit is released. A paddle tapped during an element is remembered, as in Mode B.</w:t>
       </w:r>
     </w:p>
     <w:p>
@@ -2483,7 +2506,7 @@
           <w:sz w:val="22"/>
           <w:szCs w:val="22"/>
         </w:rPr>
-        <w:t xml:space="preserve">Mode A/B selection is saved to flash and restored on power cycle.</w:t>
+        <w:t xml:space="preserve">Keyer mode selection is saved to flash and restored on power cycle.</w:t>
       </w:r>
     </w:p>
     <w:p>
@@ -4573,7 +4596,7 @@
                 <w:sz w:val="20"/>
                 <w:szCs w:val="20"/>
               </w:rPr>
-              <w:t xml:space="preserve">Iambic Modes</w:t>
+              <w:t xml:space="preserve">Keyer Modes</w:t>
             </w:r>
           </w:p>
         </w:tc>
@@ -4604,7 +4627,7 @@
                 <w:sz w:val="20"/>
                 <w:szCs w:val="20"/>
               </w:rPr>
-              <w:t xml:space="preserve">Mode A and Mode B (GPIO16 long press)</w:t>
+              <w:t xml:space="preserve">Mode A, Mode B and Ultimatic (GPIO16 long press)</w:t>
             </w:r>
           </w:p>
         </w:tc>
@@ -5318,7 +5341,7 @@
                 <w:sz w:val="20"/>
                 <w:szCs w:val="20"/>
               </w:rPr>
-              <w:t xml:space="preserve">Iambic Mode</w:t>
+              <w:t xml:space="preserve">Keyer Mode</w:t>
             </w:r>
           </w:p>
         </w:tc>
@@ -8559,7 +8582,7 @@
           <w:sz w:val="18"/>
           <w:szCs w:val="18"/>
         </w:rPr>
-        <w:t xml:space="preserve">K0WLY Two-Way CW Keyer — Preliminary Manual v1.4.4 — 73 de K0WLY</w:t>
+        <w:t xml:space="preserve">K0WLY Two-Way CW Keyer — Preliminary Manual v1.4.6 — 73 de K0WLY</w:t>
       </w:r>
     </w:p>
     <w:sectPr>
@@ -8632,7 +8655,7 @@
         <w:sz w:val="14"/>
         <w:szCs w:val="14"/>
       </w:rPr>
-      <w:t xml:space="preserve">K0WLY Two-Way CW Keyer — Preliminary Manual v1.4.4 — Copyright © 2026 K0WLY — CERN-OHL-W v2 / CC BY 4.0</w:t>
+      <w:t xml:space="preserve">K0WLY Two-Way CW Keyer — Preliminary Manual v1.4.6 — Copyright © 2026 K0WLY — CERN-OHL-W v2 / CC BY 4.0</w:t>
     </w:r>
   </w:p>
 </w:ftr>

</xml_diff>

<commit_message>
Update manuals to v1.4.9 and regenerate manual PDF
Co-Authored-By: Claude Sonnet 5.5 <noreply@anthropic.com>
Claude-Session: https://claude.ai/code/session_01FgUwPeQZb4nSMdptaYUNCX
</commit_message>
<xml_diff>
--- a/docs/K0WLY_CW_Keyer_Manual.docx
+++ b/docs/K0WLY_CW_Keyer_Manual.docx
@@ -63,7 +63,7 @@
           <w:sz w:val="24"/>
           <w:szCs w:val="24"/>
         </w:rPr>
-        <w:t xml:space="preserve">Version 1.4.4</w:t>
+        <w:t xml:space="preserve">Version 1.4.9</w:t>
       </w:r>
     </w:p>
     <w:p>
@@ -159,7 +159,7 @@
           <w:sz w:val="22"/>
           <w:szCs w:val="22"/>
         </w:rPr>
-        <w:t xml:space="preserve">The K0WLY Two-Way CW Keyer is an ESP32-S3 based iambic keyer on the LilyGO T-Display S3 AMOLED (v1.4.4).</w:t>
+        <w:t xml:space="preserve">The K0WLY Two-Way CW Keyer is an ESP32-S3 based iambic keyer on the LilyGO T-Display S3 AMOLED (v1.4.9).</w:t>
       </w:r>
     </w:p>
     <w:p>
@@ -3044,7 +3044,7 @@
                 <w:sz w:val="20"/>
                 <w:szCs w:val="20"/>
               </w:rPr>
-              <w:t xml:space="preserve">Save and exit edit</w:t>
+              <w:t xml:space="preserve">Exit edit and advance to the next parameter (in WPM, the first short press moves to the Farnsworth step). Values save as you adjust</w:t>
             </w:r>
           </w:p>
         </w:tc>
@@ -3625,7 +3625,7 @@
                 <w:sz w:val="20"/>
                 <w:szCs w:val="20"/>
               </w:rPr>
-              <w:t xml:space="preserve">0–100%</w:t>
+              <w:t xml:space="preserve">2–100%</w:t>
             </w:r>
           </w:p>
         </w:tc>
@@ -3981,7 +3981,7 @@
           <w:sz w:val="22"/>
           <w:szCs w:val="22"/>
         </w:rPr>
-        <w:t xml:space="preserve">Newlines become word spaces</w:t>
+        <w:t xml:space="preserve">A newline counts as one word gap; blank lines and a newline right after a space add nothing extra. Spaces you type are always kept</w:t>
       </w:r>
     </w:p>
     <w:p>
@@ -5221,7 +5221,7 @@
                 <w:sz w:val="20"/>
                 <w:szCs w:val="20"/>
               </w:rPr>
-              <w:t xml:space="preserve">50%</w:t>
+              <w:t xml:space="preserve">64%</w:t>
             </w:r>
           </w:p>
         </w:tc>
@@ -8559,7 +8559,7 @@
           <w:sz w:val="18"/>
           <w:szCs w:val="18"/>
         </w:rPr>
-        <w:t xml:space="preserve">K0WLY Two-Way CW Keyer — Preliminary Manual v1.4.4 — 73 de K0WLY</w:t>
+        <w:t xml:space="preserve">K0WLY Two-Way CW Keyer — Preliminary Manual v1.4.9 — 73 de K0WLY</w:t>
       </w:r>
     </w:p>
     <w:sectPr>
@@ -8632,7 +8632,7 @@
         <w:sz w:val="14"/>
         <w:szCs w:val="14"/>
       </w:rPr>
-      <w:t xml:space="preserve">K0WLY Two-Way CW Keyer — Preliminary Manual v1.4.4 — Copyright © 2026 K0WLY — CERN-OHL-W v2 / CC BY 4.0</w:t>
+      <w:t xml:space="preserve">K0WLY Two-Way CW Keyer — Preliminary Manual v1.4.9 — Copyright © 2026 K0WLY — CERN-OHL-W v2 / CC BY 4.0</w:t>
     </w:r>
   </w:p>
 </w:ftr>

</xml_diff>

<commit_message>
Release v1.4.9: add Ultimatic keying mode
On a squeeze, the most recently pressed paddle wins and its element
repeats while held. GPIO16 long press now cycles A -> B -> U, and the
header shows U for Ultimatic. Key mode is stored in NVS as "keyMode",
falling back to the old "modeB" setting so existing units keep A/B.

Update README, CHANGELOG, Manual and User Guide (.docx) to v1.4.9.

Co-Authored-By: Claude Opus 5.5 (1M context) <noreply@anthropic.com>
</commit_message>
<xml_diff>
--- a/docs/K0WLY_CW_Keyer_Manual.docx
+++ b/docs/K0WLY_CW_Keyer_Manual.docx
@@ -63,7 +63,7 @@
           <w:sz w:val="24"/>
           <w:szCs w:val="24"/>
         </w:rPr>
-        <w:t xml:space="preserve">Version 1.4.4</w:t>
+        <w:t xml:space="preserve">Version 1.4.9</w:t>
       </w:r>
     </w:p>
     <w:p>
@@ -159,7 +159,7 @@
           <w:sz w:val="22"/>
           <w:szCs w:val="22"/>
         </w:rPr>
-        <w:t xml:space="preserve">The K0WLY Two-Way CW Keyer is an ESP32-S3 based iambic keyer on the LilyGO T-Display S3 AMOLED (v1.4.4).</w:t>
+        <w:t xml:space="preserve">The K0WLY Two-Way CW Keyer is an ESP32-S3 based iambic keyer on the LilyGO T-Display S3 AMOLED (v1.4.9).</w:t>
       </w:r>
     </w:p>
     <w:p>
@@ -185,7 +185,7 @@
           <w:sz w:val="22"/>
           <w:szCs w:val="22"/>
         </w:rPr>
-        <w:t xml:space="preserve">Iambic Mode A or B keyer, 5–40 WPM, straight key mode</w:t>
+        <w:t xml:space="preserve">Iambic Mode A or B, or Ultimatic keyer, 5–40 WPM, straight key mode</w:t>
       </w:r>
     </w:p>
     <w:p>
@@ -257,7 +257,7 @@
           <w:sz w:val="22"/>
           <w:szCs w:val="22"/>
         </w:rPr>
-        <w:t xml:space="preserve">Paddle reverse and Iambic Mode A/B via GPIO16</w:t>
+        <w:t xml:space="preserve">Paddle reverse and key mode (A/B/Ultimatic) via GPIO16</w:t>
       </w:r>
     </w:p>
     <w:p>
@@ -612,7 +612,7 @@
                 <w:sz w:val="20"/>
                 <w:szCs w:val="20"/>
               </w:rPr>
-              <w:t xml:space="preserve">WPM, Hz, DLY, VOL, GAP, A/B/SK, SOLO/DUAL</w:t>
+              <w:t xml:space="preserve">WPM, Hz, DLY, VOL, GAP, A/B/U/SK, SOLO/DUAL</w:t>
             </w:r>
           </w:p>
         </w:tc>
@@ -1032,7 +1032,7 @@
           <w:sz w:val="22"/>
           <w:szCs w:val="22"/>
         </w:rPr>
-        <w:t xml:space="preserve">A / B / SK — Iambic Mode A, Iambic Mode B, or Straight Key</w:t>
+        <w:t xml:space="preserve">A / B / U / SK — Iambic Mode A, Iambic Mode B, Ultimatic, or Straight Key</w:t>
       </w:r>
     </w:p>
     <w:p>
@@ -1803,7 +1803,7 @@
                 <w:sz w:val="20"/>
                 <w:szCs w:val="20"/>
               </w:rPr>
-              <w:t xml:space="preserve">Paddle Reverse / Mode A/B</w:t>
+              <w:t xml:space="preserve">Paddle Reverse / Key Mode</w:t>
             </w:r>
           </w:p>
         </w:tc>
@@ -1865,7 +1865,7 @@
                 <w:sz w:val="20"/>
                 <w:szCs w:val="20"/>
               </w:rPr>
-              <w:t xml:space="preserve">Short=dit/dah swap, Long=Mode A/B toggle</w:t>
+              <w:t xml:space="preserve">Short=dit/dah swap, Long=cycle A/B/U</w:t>
             </w:r>
           </w:p>
         </w:tc>
@@ -2383,7 +2383,7 @@
                 <w:sz w:val="20"/>
                 <w:szCs w:val="20"/>
               </w:rPr>
-              <w:t xml:space="preserve">Toggles Iambic Mode A / Mode B — header shows A or B</w:t>
+              <w:t xml:space="preserve">Cycles key mode A → B → U (Ultimatic) — header shows A, B or U</w:t>
             </w:r>
           </w:p>
         </w:tc>
@@ -2410,7 +2410,7 @@
           <w:sz w:val="26"/>
           <w:szCs w:val="26"/>
         </w:rPr>
-        <w:t xml:space="preserve">3.3 Iambic Modes</w:t>
+        <w:t xml:space="preserve">3.3 Keying Modes</w:t>
       </w:r>
     </w:p>
     <w:p>
@@ -2449,6 +2449,29 @@
           <w:szCs w:val="22"/>
         </w:rPr>
         <w:t xml:space="preserve">Mode B — when both paddles are released during an element, the keyer sends one additional opposite element before stopping. Preferred by some operators for smoother squeeze keying.</w:t>
+      </w:r>
+    </w:p>
+    <w:p>
+      <w:pPr>
+        <w:spacing w:after="120"/>
+      </w:pPr>
+      <w:r>
+        <w:t xml:space="preserve"/>
+      </w:r>
+    </w:p>
+    <w:p>
+      <w:pPr>
+        <w:spacing w:after="120"/>
+      </w:pPr>
+      <w:r>
+        <w:rPr>
+          <w:rFonts w:ascii="Arial" w:cs="Arial" w:eastAsia="Arial" w:hAnsi="Arial"/>
+          <w:b w:val="false"/>
+          <w:bCs w:val="false"/>
+          <w:sz w:val="22"/>
+          <w:szCs w:val="22"/>
+        </w:rPr>
+        <w:t xml:space="preserve">Ultimatic — when both paddles are squeezed, the paddle pressed most recently wins and its element repeats while held; releasing it returns to the other paddle. With one paddle at a time it keys the same as Iambic, and a tap of the opposite paddle during an element is remembered as in Mode B.</w:t>
       </w:r>
     </w:p>
     <w:p>
@@ -2483,7 +2506,7 @@
           <w:sz w:val="22"/>
           <w:szCs w:val="22"/>
         </w:rPr>
-        <w:t xml:space="preserve">Mode A/B selection is saved to flash and restored on power cycle.</w:t>
+        <w:t xml:space="preserve">Key mode selection is saved to flash and restored on power cycle.</w:t>
       </w:r>
     </w:p>
     <w:p>
@@ -4573,7 +4596,7 @@
                 <w:sz w:val="20"/>
                 <w:szCs w:val="20"/>
               </w:rPr>
-              <w:t xml:space="preserve">Iambic Modes</w:t>
+              <w:t xml:space="preserve">Keying Modes</w:t>
             </w:r>
           </w:p>
         </w:tc>
@@ -4604,7 +4627,7 @@
                 <w:sz w:val="20"/>
                 <w:szCs w:val="20"/>
               </w:rPr>
-              <w:t xml:space="preserve">Mode A and Mode B (GPIO16 long press)</w:t>
+              <w:t xml:space="preserve">Mode A, Mode B, Ultimatic (GPIO16 long press)</w:t>
             </w:r>
           </w:p>
         </w:tc>
@@ -5318,7 +5341,7 @@
                 <w:sz w:val="20"/>
                 <w:szCs w:val="20"/>
               </w:rPr>
-              <w:t xml:space="preserve">Iambic Mode</w:t>
+              <w:t xml:space="preserve">Key Mode</w:t>
             </w:r>
           </w:p>
         </w:tc>
@@ -8559,7 +8582,7 @@
           <w:sz w:val="18"/>
           <w:szCs w:val="18"/>
         </w:rPr>
-        <w:t xml:space="preserve">K0WLY Two-Way CW Keyer — Preliminary Manual v1.4.4 — 73 de K0WLY</w:t>
+        <w:t xml:space="preserve">K0WLY Two-Way CW Keyer — Preliminary Manual v1.4.9 — 73 de K0WLY</w:t>
       </w:r>
     </w:p>
     <w:sectPr>
@@ -8632,7 +8655,7 @@
         <w:sz w:val="14"/>
         <w:szCs w:val="14"/>
       </w:rPr>
-      <w:t xml:space="preserve">K0WLY Two-Way CW Keyer — Preliminary Manual v1.4.4 — Copyright © 2026 K0WLY — CERN-OHL-W v2 / CC BY 4.0</w:t>
+      <w:t xml:space="preserve">K0WLY Two-Way CW Keyer — Preliminary Manual v1.4.9 — Copyright © 2026 K0WLY — CERN-OHL-W v2 / CC BY 4.0</w:t>
     </w:r>
   </w:p>
 </w:ftr>

</xml_diff>

<commit_message>
Add Ultimatic keyer mode (v1.5.0)
When both paddles are squeezed, the most recently pressed paddle wins and
repeats instead of alternating. GPIO16 long press now cycles A -> B -> U,
and the header shows A, B or U. The keyer mode is stored in NVS as "kmode";
units with only the old "modeB" key keep their A/B setting.

Bump version to 1.5.0, update README, CHANGELOG and both manuals, and
regenerate the manual PDF.

Co-Authored-By: Claude Opus 5.5 (1M context) <noreply@anthropic.com>
</commit_message>
<xml_diff>
--- a/docs/K0WLY_CW_Keyer_Manual.docx
+++ b/docs/K0WLY_CW_Keyer_Manual.docx
@@ -63,7 +63,7 @@
           <w:sz w:val="24"/>
           <w:szCs w:val="24"/>
         </w:rPr>
-        <w:t xml:space="preserve">Version 1.4.9</w:t>
+        <w:t xml:space="preserve">Version 1.5.0</w:t>
       </w:r>
     </w:p>
     <w:p>
@@ -159,7 +159,7 @@
           <w:sz w:val="22"/>
           <w:szCs w:val="22"/>
         </w:rPr>
-        <w:t xml:space="preserve">The K0WLY Two-Way CW Keyer is an ESP32-S3 based iambic keyer on the LilyGO T-Display S3 AMOLED (v1.4.9).</w:t>
+        <w:t xml:space="preserve">The K0WLY Two-Way CW Keyer is an ESP32-S3 based iambic keyer on the LilyGO T-Display S3 AMOLED (v1.5.0).</w:t>
       </w:r>
     </w:p>
     <w:p>
@@ -185,7 +185,7 @@
           <w:sz w:val="22"/>
           <w:szCs w:val="22"/>
         </w:rPr>
-        <w:t xml:space="preserve">Iambic Mode A or B keyer, 5–40 WPM, straight key mode</w:t>
+        <w:t xml:space="preserve">Iambic Mode A, Iambic Mode B or Ultimatic keyer, 5–40 WPM, straight key mode</w:t>
       </w:r>
     </w:p>
     <w:p>
@@ -257,7 +257,7 @@
           <w:sz w:val="22"/>
           <w:szCs w:val="22"/>
         </w:rPr>
-        <w:t xml:space="preserve">Paddle reverse and Iambic Mode A/B via GPIO16</w:t>
+        <w:t xml:space="preserve">Paddle reverse and keyer mode (A/B/Ultimatic) via GPIO16</w:t>
       </w:r>
     </w:p>
     <w:p>
@@ -612,7 +612,7 @@
                 <w:sz w:val="20"/>
                 <w:szCs w:val="20"/>
               </w:rPr>
-              <w:t xml:space="preserve">WPM, Hz, DLY, VOL, GAP, A/B/SK, SOLO/DUAL</w:t>
+              <w:t xml:space="preserve">WPM, Hz, DLY, VOL, GAP, A/B/U/SK, SOLO/DUAL</w:t>
             </w:r>
           </w:p>
         </w:tc>
@@ -1032,7 +1032,7 @@
           <w:sz w:val="22"/>
           <w:szCs w:val="22"/>
         </w:rPr>
-        <w:t xml:space="preserve">A / B / SK — Iambic Mode A, Iambic Mode B, or Straight Key</w:t>
+        <w:t xml:space="preserve">A / B / U / SK — Iambic Mode A, Iambic Mode B, Ultimatic, or Straight Key</w:t>
       </w:r>
     </w:p>
     <w:p>
@@ -1803,7 +1803,7 @@
                 <w:sz w:val="20"/>
                 <w:szCs w:val="20"/>
               </w:rPr>
-              <w:t xml:space="preserve">Paddle Reverse / Mode A/B</w:t>
+              <w:t xml:space="preserve">Paddle Reverse / Keyer Mode</w:t>
             </w:r>
           </w:p>
         </w:tc>
@@ -1865,7 +1865,7 @@
                 <w:sz w:val="20"/>
                 <w:szCs w:val="20"/>
               </w:rPr>
-              <w:t xml:space="preserve">Short=dit/dah swap, Long=Mode A/B toggle</w:t>
+              <w:t xml:space="preserve">Short=dit/dah swap, Long=cycle Mode A/B/U</w:t>
             </w:r>
           </w:p>
         </w:tc>
@@ -2383,7 +2383,7 @@
                 <w:sz w:val="20"/>
                 <w:szCs w:val="20"/>
               </w:rPr>
-              <w:t xml:space="preserve">Toggles Iambic Mode A / Mode B — header shows A or B</w:t>
+              <w:t xml:space="preserve">Cycles keyer mode A → B → U (Ultimatic) → A — header shows A, B or U</w:t>
             </w:r>
           </w:p>
         </w:tc>
@@ -2410,7 +2410,7 @@
           <w:sz w:val="26"/>
           <w:szCs w:val="26"/>
         </w:rPr>
-        <w:t xml:space="preserve">3.3 Iambic Modes</w:t>
+        <w:t xml:space="preserve">3.3 Keyer Modes</w:t>
       </w:r>
     </w:p>
     <w:p>
@@ -2449,6 +2449,21 @@
           <w:szCs w:val="22"/>
         </w:rPr>
         <w:t xml:space="preserve">Mode B — when both paddles are released during an element, the keyer sends one additional opposite element before stopping. Preferred by some operators for smoother squeeze keying.</w:t>
+      </w:r>
+    </w:p>
+    <w:p>
+      <w:pPr>
+        <w:spacing w:after="120"/>
+      </w:pPr>
+      <w:r>
+        <w:rPr>
+          <w:rFonts w:ascii="Arial" w:cs="Arial" w:eastAsia="Arial" w:hAnsi="Arial"/>
+          <w:b w:val="false"/>
+          <w:bCs w:val="false"/>
+          <w:sz w:val="22"/>
+          <w:szCs w:val="22"/>
+        </w:rPr>
+        <w:t xml:space="preserve">Ultimatic (U) — when both paddles are squeezed, the paddle pressed most recently wins and repeats instead of alternating. Releasing it returns to the paddle still held. A tap on the opposite paddle during an element is remembered and sent next.</w:t>
       </w:r>
     </w:p>
     <w:p>
@@ -2483,7 +2498,7 @@
           <w:sz w:val="22"/>
           <w:szCs w:val="22"/>
         </w:rPr>
-        <w:t xml:space="preserve">Mode A/B selection is saved to flash and restored on power cycle.</w:t>
+        <w:t xml:space="preserve">Keyer mode (A/B/U) is saved to flash and restored on power cycle.</w:t>
       </w:r>
     </w:p>
     <w:p>
@@ -4573,7 +4588,7 @@
                 <w:sz w:val="20"/>
                 <w:szCs w:val="20"/>
               </w:rPr>
-              <w:t xml:space="preserve">Iambic Modes</w:t>
+              <w:t xml:space="preserve">Keyer Modes</w:t>
             </w:r>
           </w:p>
         </w:tc>
@@ -4604,7 +4619,7 @@
                 <w:sz w:val="20"/>
                 <w:szCs w:val="20"/>
               </w:rPr>
-              <w:t xml:space="preserve">Mode A and Mode B (GPIO16 long press)</w:t>
+              <w:t xml:space="preserve">Mode A, Mode B and Ultimatic (GPIO16 long press)</w:t>
             </w:r>
           </w:p>
         </w:tc>
@@ -5318,7 +5333,7 @@
                 <w:sz w:val="20"/>
                 <w:szCs w:val="20"/>
               </w:rPr>
-              <w:t xml:space="preserve">Iambic Mode</w:t>
+              <w:t xml:space="preserve">Keyer Mode</w:t>
             </w:r>
           </w:p>
         </w:tc>
@@ -8559,7 +8574,7 @@
           <w:sz w:val="18"/>
           <w:szCs w:val="18"/>
         </w:rPr>
-        <w:t xml:space="preserve">K0WLY Two-Way CW Keyer — Preliminary Manual v1.4.9 — 73 de K0WLY</w:t>
+        <w:t xml:space="preserve">K0WLY Two-Way CW Keyer — Preliminary Manual v1.5.0 — 73 de K0WLY</w:t>
       </w:r>
     </w:p>
     <w:sectPr>
@@ -8632,7 +8647,7 @@
         <w:sz w:val="14"/>
         <w:szCs w:val="14"/>
       </w:rPr>
-      <w:t xml:space="preserve">K0WLY Two-Way CW Keyer — Preliminary Manual v1.4.9 — Copyright © 2026 K0WLY — CERN-OHL-W v2 / CC BY 4.0</w:t>
+      <w:t xml:space="preserve">K0WLY Two-Way CW Keyer — Preliminary Manual v1.5.0 — Copyright © 2026 K0WLY — CERN-OHL-W v2 / CC BY 4.0</w:t>
     </w:r>
   </w:p>
 </w:ftr>

</xml_diff>

<commit_message>
Farnsworth: second number is now overall (effective) speed; v1.4.10
Gap unit = (60000/overall - 31*charDit)/19. Keeps overall speed when
character speed changes with Farnsworth on. Docs and changelog updated.

Co-Authored-By: Claude Sonnet 5.5 <noreply@anthropic.com>
Claude-Session: https://claude.ai/code/session_01FgUwPeQZb4nSMdptaYUNCX
</commit_message>
<xml_diff>
--- a/docs/K0WLY_CW_Keyer_Manual.docx
+++ b/docs/K0WLY_CW_Keyer_Manual.docx
@@ -63,7 +63,7 @@
           <w:sz w:val="24"/>
           <w:szCs w:val="24"/>
         </w:rPr>
-        <w:t xml:space="preserve">Version 1.4.9</w:t>
+        <w:t xml:space="preserve">Version 1.4.10</w:t>
       </w:r>
     </w:p>
     <w:p>
@@ -159,7 +159,7 @@
           <w:sz w:val="22"/>
           <w:szCs w:val="22"/>
         </w:rPr>
-        <w:t xml:space="preserve">The K0WLY Two-Way CW Keyer is an ESP32-S3 based iambic keyer on the LilyGO T-Display S3 AMOLED (v1.4.9).</w:t>
+        <w:t xml:space="preserve">The K0WLY Two-Way CW Keyer is an ESP32-S3 based iambic keyer on the LilyGO T-Display S3 AMOLED (v1.4.10).</w:t>
       </w:r>
     </w:p>
     <w:p>
@@ -203,7 +203,7 @@
           <w:sz w:val="22"/>
           <w:szCs w:val="22"/>
         </w:rPr>
-        <w:t xml:space="preserve">Farnsworth spacing — independent character and gap speeds</w:t>
+        <w:t xml:space="preserve">Farnsworth spacing — character speed plus overall (effective) speed, e.g. 20/10</w:t>
       </w:r>
     </w:p>
     <w:p>
@@ -942,7 +942,7 @@
           <w:sz w:val="22"/>
           <w:szCs w:val="22"/>
         </w:rPr>
-        <w:t xml:space="preserve">WPM or WPM/FARN — character/Farnsworth speeds</w:t>
+        <w:t xml:space="preserve">WPM or WPM/FARN — character speed / overall (effective) speed</w:t>
       </w:r>
     </w:p>
     <w:p>
@@ -3371,7 +3371,7 @@
                 <w:sz w:val="20"/>
                 <w:szCs w:val="20"/>
               </w:rPr>
-              <w:t xml:space="preserve">Gap speed</w:t>
+              <w:t xml:space="preserve">Overall (effective) speed</w:t>
             </w:r>
           </w:p>
         </w:tc>
@@ -8559,7 +8559,7 @@
           <w:sz w:val="18"/>
           <w:szCs w:val="18"/>
         </w:rPr>
-        <w:t xml:space="preserve">K0WLY Two-Way CW Keyer — Preliminary Manual v1.4.9 — 73 de K0WLY</w:t>
+        <w:t xml:space="preserve">K0WLY Two-Way CW Keyer — Preliminary Manual v1.4.10 — 73 de K0WLY</w:t>
       </w:r>
     </w:p>
     <w:sectPr>
@@ -8632,7 +8632,7 @@
         <w:sz w:val="14"/>
         <w:szCs w:val="14"/>
       </w:rPr>
-      <w:t xml:space="preserve">K0WLY Two-Way CW Keyer — Preliminary Manual v1.4.9 — Copyright © 2026 K0WLY — CERN-OHL-W v2 / CC BY 4.0</w:t>
+      <w:t xml:space="preserve">K0WLY Two-Way CW Keyer — Preliminary Manual v1.4.10 — Copyright © 2026 K0WLY — CERN-OHL-W v2 / CC BY 4.0</w:t>
     </w:r>
   </w:p>
 </w:ftr>

</xml_diff>

<commit_message>
Update manuals to v1.6.0, regenerate manual PDF
</commit_message>
<xml_diff>
--- a/docs/K0WLY_CW_Keyer_Manual.docx
+++ b/docs/K0WLY_CW_Keyer_Manual.docx
@@ -63,7 +63,7 @@
           <w:sz w:val="24"/>
           <w:szCs w:val="24"/>
         </w:rPr>
-        <w:t xml:space="preserve">Version 1.5.0</w:t>
+        <w:t xml:space="preserve">Version 1.6.0</w:t>
       </w:r>
     </w:p>
     <w:p>
@@ -159,7 +159,7 @@
           <w:sz w:val="22"/>
           <w:szCs w:val="22"/>
         </w:rPr>
-        <w:t xml:space="preserve">The K0WLY Two-Way CW Keyer is an ESP32-S3 based iambic keyer on the LilyGO T-Display S3 AMOLED (v1.5.0).</w:t>
+        <w:t xml:space="preserve">The K0WLY Two-Way CW Keyer is an ESP32-S3 based iambic keyer on the LilyGO T-Display S3 AMOLED (v1.6.0).</w:t>
       </w:r>
     </w:p>
     <w:p>
@@ -329,7 +329,7 @@
           <w:sz w:val="22"/>
           <w:szCs w:val="22"/>
         </w:rPr>
-        <w:t xml:space="preserve">WiFi AP (K0WLY-XXXX) with web interface for file management</w:t>
+        <w:t xml:space="preserve">WiFi AP (K0WLY-XXXX) with web interface for settings and file management</w:t>
       </w:r>
     </w:p>
     <w:p>
@@ -3864,7 +3864,97 @@
           <w:sz w:val="22"/>
           <w:szCs w:val="22"/>
         </w:rPr>
-        <w:t xml:space="preserve">Dit/Dah Swap button (orange)</w:t>
+        <w:t xml:space="preserve">Settings tiles — Char Speed, Farnsworth, Frequency, Volume, Head Copy Delay and Word Gap each have − and + buttons</w:t>
+      </w:r>
+    </w:p>
+    <w:p>
+      <w:pPr>
+        <w:pStyle w:val="ListParagraph"/>
+        <w:numPr>
+          <w:ilvl w:val="0"/>
+          <w:numId w:val="2"/>
+        </w:numPr>
+        <w:spacing w:after="80"/>
+      </w:pPr>
+      <w:r>
+        <w:rPr>
+          <w:rFonts w:ascii="Arial" w:cs="Arial" w:eastAsia="Arial" w:hAnsi="Arial"/>
+          <w:sz w:val="22"/>
+          <w:szCs w:val="22"/>
+        </w:rPr>
+        <w:t xml:space="preserve">Keyer Mode tile — tap Iambic A, Iambic B or Ultimatic</w:t>
+      </w:r>
+    </w:p>
+    <w:p>
+      <w:pPr>
+        <w:pStyle w:val="ListParagraph"/>
+        <w:numPr>
+          <w:ilvl w:val="0"/>
+          <w:numId w:val="2"/>
+        </w:numPr>
+        <w:spacing w:after="80"/>
+      </w:pPr>
+      <w:r>
+        <w:rPr>
+          <w:rFonts w:ascii="Arial" w:cs="Arial" w:eastAsia="Arial" w:hAnsi="Arial"/>
+          <w:sz w:val="22"/>
+          <w:szCs w:val="22"/>
+        </w:rPr>
+        <w:t xml:space="preserve">Paddles tile — tap Dit-Dah or Dah-Dit (same as the hardware paddle reverse button)</w:t>
+      </w:r>
+    </w:p>
+    <w:p>
+      <w:pPr>
+        <w:pStyle w:val="ListParagraph"/>
+        <w:numPr>
+          <w:ilvl w:val="0"/>
+          <w:numId w:val="2"/>
+        </w:numPr>
+        <w:spacing w:after="80"/>
+      </w:pPr>
+      <w:r>
+        <w:rPr>
+          <w:rFonts w:ascii="Arial" w:cs="Arial" w:eastAsia="Arial" w:hAnsi="Arial"/>
+          <w:sz w:val="22"/>
+          <w:szCs w:val="22"/>
+        </w:rPr>
+        <w:t xml:space="preserve">Changes are saved on the keyer, and the page picks up changes made with the knob and buttons every 2 seconds</w:t>
+      </w:r>
+    </w:p>
+    <w:p>
+      <w:pPr>
+        <w:pStyle w:val="ListParagraph"/>
+        <w:numPr>
+          <w:ilvl w:val="0"/>
+          <w:numId w:val="2"/>
+        </w:numPr>
+        <w:spacing w:after="80"/>
+      </w:pPr>
+      <w:r>
+        <w:rPr>
+          <w:rFonts w:ascii="Arial" w:cs="Arial" w:eastAsia="Arial" w:hAnsi="Arial"/>
+          <w:sz w:val="22"/>
+          <w:szCs w:val="22"/>
+        </w:rPr>
+        <w:t xml:space="preserve">Farnsworth shows OFF when it equals the character speed</w:t>
+      </w:r>
+    </w:p>
+    <w:p>
+      <w:pPr>
+        <w:pStyle w:val="ListParagraph"/>
+        <w:numPr>
+          <w:ilvl w:val="0"/>
+          <w:numId w:val="2"/>
+        </w:numPr>
+        <w:spacing w:after="80"/>
+      </w:pPr>
+      <w:r>
+        <w:rPr>
+          <w:rFonts w:ascii="Arial" w:cs="Arial" w:eastAsia="Arial" w:hAnsi="Arial"/>
+          <w:sz w:val="22"/>
+          <w:szCs w:val="22"/>
+        </w:rPr>
+        <w:t xml:space="preserve">On the web page, character speed steps 38 ↔ 40 (39 is skipped, since 39 and 40 WPM share the same 30 ms dit). The knob and buttons can still select 39</w:t>
       </w:r>
     </w:p>
     <w:p>
@@ -8574,7 +8664,7 @@
           <w:sz w:val="18"/>
           <w:szCs w:val="18"/>
         </w:rPr>
-        <w:t xml:space="preserve">K0WLY Two-Way CW Keyer — Preliminary Manual v1.5.0 — 73 de K0WLY</w:t>
+        <w:t xml:space="preserve">K0WLY Two-Way CW Keyer — Preliminary Manual v1.6.0 — 73 de K0WLY</w:t>
       </w:r>
     </w:p>
     <w:sectPr>
@@ -8647,7 +8737,7 @@
         <w:sz w:val="14"/>
         <w:szCs w:val="14"/>
       </w:rPr>
-      <w:t xml:space="preserve">K0WLY Two-Way CW Keyer — Preliminary Manual v1.5.0 — Copyright © 2026 K0WLY — CERN-OHL-W v2 / CC BY 4.0</w:t>
+      <w:t xml:space="preserve">K0WLY Two-Way CW Keyer — Preliminary Manual v1.6.0 — Copyright © 2026 K0WLY — CERN-OHL-W v2 / CC BY 4.0</w:t>
     </w:r>
   </w:p>
 </w:ftr>

</xml_diff>